<commit_message>
Portal: Daily e Crew na conta de verdade (fatias 3 e 4), PT e EN
Situação do protótipo dos dois módulos diz o que já funciona no banco (ponto e diário com e sem
internet, lacre, link do cliente, aprovação entre empresas, aviso e registro de localização,
construtora sem valores); manual e regras do Crew com o aviso de localização e os registros reais.

Co-Authored-By: Claude Fable 5.1 <noreply@anthropic.com>
Claude-Session: https://claude.ai/code/session_01Ep8bJsuQq2bqGePCMzzux2
</commit_message>
<xml_diff>
--- a/portal/files/KORbuild Crew - Business rules.docx
+++ b/portal/files/KORbuild Crew - Business rules.docx
@@ -2396,7 +2396,7 @@
                 <w:i w:val="0"/>
                 <w:sz w:val="18"/>
               </w:rPr>
-              <w:t xml:space="preserve"> Recorded at each punch, when the app is opened during the workday and every 15 minutes on site (every 5 while traveling). Never during breaks, while clocked out or off hours. The worker is told so.</w:t>
+              <w:t xml:space="preserve"> Recorded at each punch, when the app is opened during the workday and every 15 minutes on site (every 5 while traveling). Never during breaks, while clocked out or off hours. The worker is told so and must accept the notice first.</w:t>
             </w:r>
           </w:p>
         </w:tc>
@@ -2412,7 +2412,7 @@
                 <w:i w:val="0"/>
                 <w:sz w:val="18"/>
               </w:rPr>
-              <w:t>Simulated (see Prototype status)</w:t>
+              <w:t>Working in the real account while the app is open (simulated in the demo); in the background, with the store app</w:t>
             </w:r>
           </w:p>
         </w:tc>

</xml_diff>